<commit_message>
Contexto da pesquisa no guia do professor
O guia ganha o que faltava para quem é externo ao estudo: de onde vem o
trabalho, que os textos de aluno são fictícios, o que acontece com a
leitura e o crédito nos agradecimentos. Continua em 3 páginas e continua
sem revelar a procedência das devolutivas.

O material de recrutamento (perfil, valor, mensagens) fica fora do
versionamento, no diretório local, e está no .gitignore.

Co-Authored-By: Claude Opus 5 (1M context) <noreply@anthropic.com>
Claude-Session: https://claude.ai/code/session_01D21Gp9qrM2tLShEsUTHJTu
</commit_message>
<xml_diff>
--- a/data/codificacao_v04/GUIA_PROFESSOR.docx
+++ b/data/codificacao_v04/GUIA_PROFESSOR.docx
@@ -2,7 +2,7 @@
 <file path=word/document.xml><?xml version="1.0" encoding="utf-8"?>
 <w:document xmlns:w="http://schemas.openxmlformats.org/wordprocessingml/2006/main" xmlns:m="http://schemas.openxmlformats.org/officeDocument/2006/math" xmlns:r="http://schemas.openxmlformats.org/officeDocument/2006/relationships" xmlns:o="urn:schemas-microsoft-com:office:office" xmlns:v="urn:schemas-microsoft-com:vml" xmlns:w10="urn:schemas-microsoft-com:office:word" xmlns:a="http://schemas.openxmlformats.org/drawingml/2006/main" xmlns:pic="http://schemas.openxmlformats.org/drawingml/2006/picture" xmlns:wp="http://schemas.openxmlformats.org/drawingml/2006/wordprocessingDrawing">
   <w:body>
-    <w:bookmarkStart w:id="18" w:name="guia-da-leitura-das-devolutivas"/>
+    <w:bookmarkStart w:id="20" w:name="guia-da-leitura-das-devolutivas"/>
     <w:p>
       <w:pPr>
         <w:pStyle w:val="Heading1"/>
@@ -68,13 +68,13 @@
         </w:pict>
       </w:r>
     </w:p>
-    <w:bookmarkStart w:id="9" w:name="o-que-você-vai-fazer"/>
+    <w:bookmarkStart w:id="9" w:name="de-onde-vem-este-trabalho"/>
     <w:p>
       <w:pPr>
         <w:pStyle w:val="Heading2"/>
       </w:pPr>
       <w:r>
-        <w:t xml:space="preserve">O que você vai fazer</w:t>
+        <w:t xml:space="preserve">De onde vem este trabalho</w:t>
       </w:r>
     </w:p>
     <w:p>
@@ -82,55 +82,25 @@
         <w:pStyle w:val="FirstParagraph"/>
       </w:pPr>
       <w:r>
-        <w:t xml:space="preserve">Você vai ler 39 devolutivas escritas para textos de alunos e, em cada uma, marcar quais tipos de</w:t>
-      </w:r>
-      <w:r>
-        <w:t xml:space="preserve"> </w:t>
-      </w:r>
-      <w:r>
-        <w:t xml:space="preserve">movimento aquela devolutiva faz: se elogia, se aponta um problema, se pergunta, se dá dica, e</w:t>
-      </w:r>
-      <w:r>
-        <w:t xml:space="preserve"> </w:t>
-      </w:r>
-      <w:r>
-        <w:t xml:space="preserve">assim por diante. São nove colunas por devolutiva, cada uma com</w:t>
-      </w:r>
-      <w:r>
-        <w:t xml:space="preserve"> </w:t>
-      </w:r>
-      <w:r>
-        <w:rPr>
-          <w:rStyle w:val="VerbatimChar"/>
-        </w:rPr>
-        <w:t xml:space="preserve">1</w:t>
-      </w:r>
-      <w:r>
-        <w:t xml:space="preserve"> </w:t>
-      </w:r>
-      <w:r>
-        <w:t xml:space="preserve">(aparece) ou</w:t>
-      </w:r>
-      <w:r>
-        <w:t xml:space="preserve"> </w:t>
-      </w:r>
-      <w:r>
-        <w:rPr>
-          <w:rStyle w:val="VerbatimChar"/>
-        </w:rPr>
-        <w:t xml:space="preserve">0</w:t>
-      </w:r>
-      <w:r>
-        <w:t xml:space="preserve"> </w:t>
-      </w:r>
-      <w:r>
-        <w:t xml:space="preserve">(não</w:t>
-      </w:r>
-      <w:r>
-        <w:t xml:space="preserve"> </w:t>
-      </w:r>
-      <w:r>
-        <w:t xml:space="preserve">aparece).</w:t>
+        <w:t xml:space="preserve">Esta leitura faz parte da minha pesquisa de doutorado no PPGIE/UFRGS, orientada pelo Prof. Marcelo</w:t>
+      </w:r>
+      <w:r>
+        <w:t xml:space="preserve"> </w:t>
+      </w:r>
+      <w:r>
+        <w:t xml:space="preserve">Magalhães Foohs. A pesquisa trata de como estudantes do Ensino Fundamental II recebem devolutiva</w:t>
+      </w:r>
+      <w:r>
+        <w:t xml:space="preserve"> </w:t>
+      </w:r>
+      <w:r>
+        <w:t xml:space="preserve">sobre o que escrevem, dentro de uma plataforma em que a professora continua conduzindo o trabalho:</w:t>
+      </w:r>
+      <w:r>
+        <w:t xml:space="preserve"> </w:t>
+      </w:r>
+      <w:r>
+        <w:t xml:space="preserve">a devolutiva é uma primeira passada, e quem decide o que chega ao aluno é ela.</w:t>
       </w:r>
     </w:p>
     <w:p>
@@ -138,112 +108,31 @@
         <w:pStyle w:val="BodyText"/>
       </w:pPr>
       <w:r>
-        <w:t xml:space="preserve">A tarefa não é dar nota nem dizer se a devolutiva é boa. É registrar o que está lá.</w:t>
-      </w:r>
-    </w:p>
-    <w:bookmarkEnd w:id="9"/>
-    <w:bookmarkStart w:id="10" w:name="como-preencher-a-planilha"/>
-    <w:p>
-      <w:pPr>
-        <w:pStyle w:val="Heading2"/>
-      </w:pPr>
-      <w:r>
-        <w:t xml:space="preserve">Como preencher a planilha</w:t>
-      </w:r>
-    </w:p>
-    <w:p>
-      <w:pPr>
-        <w:pStyle w:val="FirstParagraph"/>
-      </w:pPr>
-      <w:r>
-        <w:t xml:space="preserve">Cada linha é uma devolutiva, com o texto do aluno ao lado. Você escreve</w:t>
-      </w:r>
-      <w:r>
-        <w:t xml:space="preserve"> </w:t>
-      </w:r>
-      <w:r>
-        <w:rPr>
-          <w:rStyle w:val="VerbatimChar"/>
-        </w:rPr>
-        <w:t xml:space="preserve">1</w:t>
-      </w:r>
-      <w:r>
-        <w:t xml:space="preserve"> </w:t>
-      </w:r>
-      <w:r>
-        <w:t xml:space="preserve">ou</w:t>
-      </w:r>
-      <w:r>
-        <w:t xml:space="preserve"> </w:t>
-      </w:r>
-      <w:r>
-        <w:rPr>
-          <w:rStyle w:val="VerbatimChar"/>
-        </w:rPr>
-        <w:t xml:space="preserve">0</w:t>
-      </w:r>
-      <w:r>
-        <w:t xml:space="preserve"> </w:t>
-      </w:r>
-      <w:r>
-        <w:t xml:space="preserve">nas colunas</w:t>
-      </w:r>
-      <w:r>
-        <w:t xml:space="preserve"> </w:t>
-      </w:r>
-      <w:r>
-        <w:rPr>
-          <w:rStyle w:val="VerbatimChar"/>
-        </w:rPr>
-        <w:t xml:space="preserve">FM01</w:t>
-      </w:r>
-      <w:r>
-        <w:t xml:space="preserve"> </w:t>
-      </w:r>
-      <w:r>
-        <w:t xml:space="preserve">a</w:t>
-      </w:r>
-      <w:r>
-        <w:t xml:space="preserve"> </w:t>
-      </w:r>
-      <w:r>
-        <w:rPr>
-          <w:rStyle w:val="VerbatimChar"/>
-        </w:rPr>
-        <w:t xml:space="preserve">FM08</w:t>
-      </w:r>
-      <w:r>
-        <w:t xml:space="preserve"> </w:t>
-      </w:r>
-      <w:r>
-        <w:t xml:space="preserve">e na coluna</w:t>
-      </w:r>
-      <w:r>
-        <w:t xml:space="preserve"> </w:t>
-      </w:r>
-      <w:r>
-        <w:rPr>
-          <w:rStyle w:val="VerbatimChar"/>
-        </w:rPr>
-        <w:t xml:space="preserve">MTL</w:t>
-      </w:r>
-      <w:r>
-        <w:t xml:space="preserve">. A coluna</w:t>
-      </w:r>
-      <w:r>
-        <w:t xml:space="preserve"> </w:t>
-      </w:r>
-      <w:r>
-        <w:rPr>
-          <w:rStyle w:val="VerbatimChar"/>
-        </w:rPr>
-        <w:t xml:space="preserve">Observações</w:t>
-      </w:r>
-      <w:r>
-        <w:t xml:space="preserve"> </w:t>
-      </w:r>
-      <w:r>
-        <w:t xml:space="preserve">é livre.</w:t>
+        <w:t xml:space="preserve">Para descrever essas devolutivas de um jeito comparável, a pesquisa usa oito tipos de movimento de</w:t>
+      </w:r>
+      <w:r>
+        <w:t xml:space="preserve"> </w:t>
+      </w:r>
+      <w:r>
+        <w:t xml:space="preserve">mediação, que são as oito colunas deste guia. O que eu preciso saber é se duas professoras</w:t>
+      </w:r>
+      <w:r>
+        <w:t xml:space="preserve"> </w:t>
+      </w:r>
+      <w:r>
+        <w:t xml:space="preserve">experientes, lendo o mesmo material com o mesmo guia, enxergam os mesmos movimentos. Por isso são</w:t>
+      </w:r>
+      <w:r>
+        <w:t xml:space="preserve"> </w:t>
+      </w:r>
+      <w:r>
+        <w:t xml:space="preserve">duas leituras independentes, e por isso a sua vale exatamente por ser sua, e não por coincidir com</w:t>
+      </w:r>
+      <w:r>
+        <w:t xml:space="preserve"> </w:t>
+      </w:r>
+      <w:r>
+        <w:t xml:space="preserve">a de alguém.</w:t>
       </w:r>
     </w:p>
     <w:p>
@@ -255,13 +144,46 @@
           <w:b/>
           <w:bCs/>
         </w:rPr>
-        <w:t xml:space="preserve">Faça em duas passadas.</w:t>
-      </w:r>
-      <w:r>
-        <w:t xml:space="preserve"> </w:t>
-      </w:r>
-      <w:r>
-        <w:t xml:space="preserve">Primeiro preencha</w:t>
+        <w:t xml:space="preserve">Os textos de aluno são fictícios</w:t>
+      </w:r>
+      <w:r>
+        <w:t xml:space="preserve">, escritos pela equipe da pesquisa para representar</w:t>
+      </w:r>
+      <w:r>
+        <w:t xml:space="preserve"> </w:t>
+      </w:r>
+      <w:r>
+        <w:t xml:space="preserve">dificuldades comuns de 8º e 9º ano. Não há produção real de estudante no material.</w:t>
+      </w:r>
+    </w:p>
+    <w:bookmarkEnd w:id="9"/>
+    <w:bookmarkStart w:id="10" w:name="o-que-você-vai-fazer"/>
+    <w:p>
+      <w:pPr>
+        <w:pStyle w:val="Heading2"/>
+      </w:pPr>
+      <w:r>
+        <w:t xml:space="preserve">O que você vai fazer</w:t>
+      </w:r>
+    </w:p>
+    <w:p>
+      <w:pPr>
+        <w:pStyle w:val="FirstParagraph"/>
+      </w:pPr>
+      <w:r>
+        <w:t xml:space="preserve">Você vai ler 39 devolutivas escritas para esses textos e, em cada uma, marcar quais tipos de</w:t>
+      </w:r>
+      <w:r>
+        <w:t xml:space="preserve"> </w:t>
+      </w:r>
+      <w:r>
+        <w:t xml:space="preserve">movimento aquela devolutiva faz: se elogia, se aponta um problema, se pergunta, se dá dica, e</w:t>
+      </w:r>
+      <w:r>
+        <w:t xml:space="preserve"> </w:t>
+      </w:r>
+      <w:r>
+        <w:t xml:space="preserve">assim por diante. São nove colunas por devolutiva, cada uma com</w:t>
       </w:r>
       <w:r>
         <w:t xml:space="preserve"> </w:t>
@@ -270,6 +192,104 @@
         <w:rPr>
           <w:rStyle w:val="VerbatimChar"/>
         </w:rPr>
+        <w:t xml:space="preserve">1</w:t>
+      </w:r>
+      <w:r>
+        <w:t xml:space="preserve"> </w:t>
+      </w:r>
+      <w:r>
+        <w:t xml:space="preserve">(aparece) ou</w:t>
+      </w:r>
+      <w:r>
+        <w:t xml:space="preserve"> </w:t>
+      </w:r>
+      <w:r>
+        <w:rPr>
+          <w:rStyle w:val="VerbatimChar"/>
+        </w:rPr>
+        <w:t xml:space="preserve">0</w:t>
+      </w:r>
+      <w:r>
+        <w:t xml:space="preserve"> </w:t>
+      </w:r>
+      <w:r>
+        <w:t xml:space="preserve">(não</w:t>
+      </w:r>
+      <w:r>
+        <w:t xml:space="preserve"> </w:t>
+      </w:r>
+      <w:r>
+        <w:t xml:space="preserve">aparece).</w:t>
+      </w:r>
+    </w:p>
+    <w:p>
+      <w:pPr>
+        <w:pStyle w:val="BodyText"/>
+      </w:pPr>
+      <w:r>
+        <w:t xml:space="preserve">A tarefa não é dar nota nem dizer se a devolutiva é boa. É registrar o que está lá. E não é</w:t>
+      </w:r>
+      <w:r>
+        <w:t xml:space="preserve"> </w:t>
+      </w:r>
+      <w:r>
+        <w:t xml:space="preserve">avaliação de professor: ninguém está sendo julgado pelo que escreveu.</w:t>
+      </w:r>
+    </w:p>
+    <w:bookmarkEnd w:id="10"/>
+    <w:bookmarkStart w:id="11" w:name="como-preencher-a-planilha"/>
+    <w:p>
+      <w:pPr>
+        <w:pStyle w:val="Heading2"/>
+      </w:pPr>
+      <w:r>
+        <w:t xml:space="preserve">Como preencher a planilha</w:t>
+      </w:r>
+    </w:p>
+    <w:p>
+      <w:pPr>
+        <w:pStyle w:val="FirstParagraph"/>
+      </w:pPr>
+      <w:r>
+        <w:t xml:space="preserve">Cada linha é uma devolutiva, com o texto do aluno ao lado. Você escreve</w:t>
+      </w:r>
+      <w:r>
+        <w:t xml:space="preserve"> </w:t>
+      </w:r>
+      <w:r>
+        <w:rPr>
+          <w:rStyle w:val="VerbatimChar"/>
+        </w:rPr>
+        <w:t xml:space="preserve">1</w:t>
+      </w:r>
+      <w:r>
+        <w:t xml:space="preserve"> </w:t>
+      </w:r>
+      <w:r>
+        <w:t xml:space="preserve">ou</w:t>
+      </w:r>
+      <w:r>
+        <w:t xml:space="preserve"> </w:t>
+      </w:r>
+      <w:r>
+        <w:rPr>
+          <w:rStyle w:val="VerbatimChar"/>
+        </w:rPr>
+        <w:t xml:space="preserve">0</w:t>
+      </w:r>
+      <w:r>
+        <w:t xml:space="preserve"> </w:t>
+      </w:r>
+      <w:r>
+        <w:t xml:space="preserve">nas colunas</w:t>
+      </w:r>
+      <w:r>
+        <w:t xml:space="preserve"> </w:t>
+      </w:r>
+      <w:r>
+        <w:rPr>
+          <w:rStyle w:val="VerbatimChar"/>
+        </w:rPr>
         <w:t xml:space="preserve">FM01</w:t>
       </w:r>
       <w:r>
@@ -291,13 +311,7 @@
         <w:t xml:space="preserve"> </w:t>
       </w:r>
       <w:r>
-        <w:t xml:space="preserve">nas 39 linhas. Só depois volte ao</w:t>
-      </w:r>
-      <w:r>
-        <w:t xml:space="preserve"> </w:t>
-      </w:r>
-      <w:r>
-        <w:t xml:space="preserve">começo e preencha a coluna</w:t>
+        <w:t xml:space="preserve">e na coluna</w:t>
       </w:r>
       <w:r>
         <w:t xml:space="preserve"> </w:t>
@@ -309,83 +323,164 @@
         <w:t xml:space="preserve">MTL</w:t>
       </w:r>
       <w:r>
-        <w:t xml:space="preserve">. As duas coisas são parecidas o suficiente para uma influenciar a</w:t>
-      </w:r>
-      <w:r>
-        <w:t xml:space="preserve"> </w:t>
-      </w:r>
-      <w:r>
-        <w:t xml:space="preserve">outra, e por isso ficam separadas.</w:t>
+        <w:t xml:space="preserve">. A coluna</w:t>
+      </w:r>
+      <w:r>
+        <w:t xml:space="preserve"> </w:t>
+      </w:r>
+      <w:r>
+        <w:rPr>
+          <w:rStyle w:val="VerbatimChar"/>
+        </w:rPr>
+        <w:t xml:space="preserve">Observações</w:t>
+      </w:r>
+      <w:r>
+        <w:t xml:space="preserve"> </w:t>
+      </w:r>
+      <w:r>
+        <w:t xml:space="preserve">é livre.</w:t>
       </w:r>
     </w:p>
     <w:p>
       <w:pPr>
         <w:pStyle w:val="BodyText"/>
-      </w:pPr>
-      <w:r>
-        <w:t xml:space="preserve">Não existe quantidade certa de marcações por devolutiva. Uma pode ter cinco colunas em</w:t>
-      </w:r>
-      <w:r>
-        <w:t xml:space="preserve"> </w:t>
-      </w:r>
-      <w:r>
-        <w:rPr>
-          <w:rStyle w:val="VerbatimChar"/>
-        </w:rPr>
-        <w:t xml:space="preserve">1</w:t>
-      </w:r>
-      <w:r>
-        <w:t xml:space="preserve"> </w:t>
-      </w:r>
-      <w:r>
-        <w:t xml:space="preserve">e outra</w:t>
-      </w:r>
-      <w:r>
-        <w:t xml:space="preserve"> </w:t>
-      </w:r>
-      <w:r>
-        <w:t xml:space="preserve">pode não ter nenhuma. Linha inteiramente zerada é resultado possível.</w:t>
-      </w:r>
-    </w:p>
-    <w:p>
-      <w:pPr>
-        <w:pStyle w:val="BodyText"/>
-      </w:pPr>
-      <w:r>
-        <w:t xml:space="preserve">Na dúvida sobre se o movimento está lá, marque</w:t>
-      </w:r>
-      <w:r>
-        <w:t xml:space="preserve"> </w:t>
-      </w:r>
-      <w:r>
-        <w:rPr>
-          <w:rStyle w:val="VerbatimChar"/>
-        </w:rPr>
-        <w:t xml:space="preserve">0</w:t>
-      </w:r>
-      <w:r>
-        <w:t xml:space="preserve">.</w:t>
-      </w:r>
-    </w:p>
-    <w:bookmarkEnd w:id="10"/>
-    <w:bookmarkStart w:id="11" w:name="as-oito-colunas-de-movimento"/>
-    <w:p>
-      <w:pPr>
-        <w:pStyle w:val="Heading2"/>
-      </w:pPr>
-      <w:r>
-        <w:t xml:space="preserve">As oito colunas de movimento</w:t>
-      </w:r>
-    </w:p>
-    <w:p>
-      <w:pPr>
-        <w:pStyle w:val="FirstParagraph"/>
       </w:pPr>
       <w:r>
         <w:rPr>
           <w:b/>
           <w:bCs/>
         </w:rPr>
+        <w:t xml:space="preserve">Faça em duas passadas.</w:t>
+      </w:r>
+      <w:r>
+        <w:t xml:space="preserve"> </w:t>
+      </w:r>
+      <w:r>
+        <w:t xml:space="preserve">Primeiro preencha</w:t>
+      </w:r>
+      <w:r>
+        <w:t xml:space="preserve"> </w:t>
+      </w:r>
+      <w:r>
+        <w:rPr>
+          <w:rStyle w:val="VerbatimChar"/>
+        </w:rPr>
+        <w:t xml:space="preserve">FM01</w:t>
+      </w:r>
+      <w:r>
+        <w:t xml:space="preserve"> </w:t>
+      </w:r>
+      <w:r>
+        <w:t xml:space="preserve">a</w:t>
+      </w:r>
+      <w:r>
+        <w:t xml:space="preserve"> </w:t>
+      </w:r>
+      <w:r>
+        <w:rPr>
+          <w:rStyle w:val="VerbatimChar"/>
+        </w:rPr>
+        <w:t xml:space="preserve">FM08</w:t>
+      </w:r>
+      <w:r>
+        <w:t xml:space="preserve"> </w:t>
+      </w:r>
+      <w:r>
+        <w:t xml:space="preserve">nas 39 linhas. Só depois volte ao</w:t>
+      </w:r>
+      <w:r>
+        <w:t xml:space="preserve"> </w:t>
+      </w:r>
+      <w:r>
+        <w:t xml:space="preserve">começo e preencha a coluna</w:t>
+      </w:r>
+      <w:r>
+        <w:t xml:space="preserve"> </w:t>
+      </w:r>
+      <w:r>
+        <w:rPr>
+          <w:rStyle w:val="VerbatimChar"/>
+        </w:rPr>
+        <w:t xml:space="preserve">MTL</w:t>
+      </w:r>
+      <w:r>
+        <w:t xml:space="preserve">. As duas coisas são parecidas o suficiente para uma influenciar a</w:t>
+      </w:r>
+      <w:r>
+        <w:t xml:space="preserve"> </w:t>
+      </w:r>
+      <w:r>
+        <w:t xml:space="preserve">outra, e por isso ficam separadas.</w:t>
+      </w:r>
+    </w:p>
+    <w:p>
+      <w:pPr>
+        <w:pStyle w:val="BodyText"/>
+      </w:pPr>
+      <w:r>
+        <w:t xml:space="preserve">Não existe quantidade certa de marcações por devolutiva. Uma pode ter cinco colunas em</w:t>
+      </w:r>
+      <w:r>
+        <w:t xml:space="preserve"> </w:t>
+      </w:r>
+      <w:r>
+        <w:rPr>
+          <w:rStyle w:val="VerbatimChar"/>
+        </w:rPr>
+        <w:t xml:space="preserve">1</w:t>
+      </w:r>
+      <w:r>
+        <w:t xml:space="preserve"> </w:t>
+      </w:r>
+      <w:r>
+        <w:t xml:space="preserve">e outra</w:t>
+      </w:r>
+      <w:r>
+        <w:t xml:space="preserve"> </w:t>
+      </w:r>
+      <w:r>
+        <w:t xml:space="preserve">pode não ter nenhuma. Linha inteiramente zerada é resultado possível.</w:t>
+      </w:r>
+    </w:p>
+    <w:p>
+      <w:pPr>
+        <w:pStyle w:val="BodyText"/>
+      </w:pPr>
+      <w:r>
+        <w:t xml:space="preserve">Na dúvida sobre se o movimento está lá, marque</w:t>
+      </w:r>
+      <w:r>
+        <w:t xml:space="preserve"> </w:t>
+      </w:r>
+      <w:r>
+        <w:rPr>
+          <w:rStyle w:val="VerbatimChar"/>
+        </w:rPr>
+        <w:t xml:space="preserve">0</w:t>
+      </w:r>
+      <w:r>
+        <w:t xml:space="preserve">.</w:t>
+      </w:r>
+    </w:p>
+    <w:bookmarkEnd w:id="11"/>
+    <w:bookmarkStart w:id="12" w:name="as-oito-colunas-de-movimento"/>
+    <w:p>
+      <w:pPr>
+        <w:pStyle w:val="Heading2"/>
+      </w:pPr>
+      <w:r>
+        <w:t xml:space="preserve">As oito colunas de movimento</w:t>
+      </w:r>
+    </w:p>
+    <w:p>
+      <w:pPr>
+        <w:pStyle w:val="FirstParagraph"/>
+      </w:pPr>
+      <w:r>
+        <w:rPr>
+          <w:b/>
+          <w:bCs/>
+        </w:rPr>
         <w:t xml:space="preserve">FM01, elogiar algo específico que o aluno fez.</w:t>
       </w:r>
       <w:r>
@@ -810,8 +905,8 @@
         <w:t xml:space="preserve">cada coluna por si.</w:t>
       </w:r>
     </w:p>
-    <w:bookmarkEnd w:id="11"/>
-    <w:bookmarkStart w:id="12" w:name="X30f47ca7b216d8dcff4b7f211a4d401d8cce040"/>
+    <w:bookmarkEnd w:id="12"/>
+    <w:bookmarkStart w:id="13" w:name="X30f47ca7b216d8dcff4b7f211a4d401d8cce040"/>
     <w:p>
       <w:pPr>
         <w:pStyle w:val="Heading2"/>
@@ -1036,8 +1131,8 @@
         <w:t xml:space="preserve">, porque nada do texto foi apontado: usar o termo não basta.</w:t>
       </w:r>
     </w:p>
-    <w:bookmarkEnd w:id="12"/>
-    <w:bookmarkStart w:id="13" w:name="a-regra-do-parece-mas-não-é"/>
+    <w:bookmarkEnd w:id="13"/>
+    <w:bookmarkStart w:id="14" w:name="a-regra-do-parece-mas-não-é"/>
     <w:p>
       <w:pPr>
         <w:pStyle w:val="Heading2"/>
@@ -1337,8 +1432,8 @@
         <w:t xml:space="preserve">pergunta ou dica funciona mesmo como elogio, pergunta ou dica.</w:t>
       </w:r>
     </w:p>
-    <w:bookmarkEnd w:id="13"/>
-    <w:bookmarkStart w:id="14" w:name="quando-escrever-em-observações"/>
+    <w:bookmarkEnd w:id="14"/>
+    <w:bookmarkStart w:id="15" w:name="quando-escrever-em-observações"/>
     <w:p>
       <w:pPr>
         <w:pStyle w:val="Heading2"/>
@@ -1450,8 +1545,8 @@
         <w:t xml:space="preserve">dúvida ou um caso difícil, é material útil.</w:t>
       </w:r>
     </w:p>
-    <w:bookmarkEnd w:id="14"/>
-    <w:bookmarkStart w:id="15" w:name="três-combinados"/>
+    <w:bookmarkEnd w:id="15"/>
+    <w:bookmarkStart w:id="16" w:name="três-combinados"/>
     <w:p>
       <w:pPr>
         <w:pStyle w:val="Heading2"/>
@@ -1538,8 +1633,8 @@
         <w:t xml:space="preserve">e siga com ela como está. Um desacordo registrado vale mais do que um acordo obtido por conversa.</w:t>
       </w:r>
     </w:p>
-    <w:bookmarkEnd w:id="15"/>
-    <w:bookmarkStart w:id="16" w:name="sobre-as-devolutivas"/>
+    <w:bookmarkEnd w:id="16"/>
+    <w:bookmarkStart w:id="17" w:name="sobre-as-devolutivas"/>
     <w:p>
       <w:pPr>
         <w:pStyle w:val="Heading2"/>
@@ -1576,13 +1671,77 @@
         <w:t xml:space="preserve">lá.</w:t>
       </w:r>
     </w:p>
-    <w:bookmarkEnd w:id="16"/>
-    <w:bookmarkStart w:id="17" w:name="quando-terminar"/>
+    <w:bookmarkEnd w:id="17"/>
+    <w:bookmarkStart w:id="18" w:name="o-que-acontece-com-a-sua-leitura"/>
     <w:p>
       <w:pPr>
         <w:pStyle w:val="Heading2"/>
       </w:pPr>
       <w:r>
+        <w:t xml:space="preserve">O que acontece com a sua leitura</w:t>
+      </w:r>
+    </w:p>
+    <w:p>
+      <w:pPr>
+        <w:pStyle w:val="FirstParagraph"/>
+      </w:pPr>
+      <w:r>
+        <w:t xml:space="preserve">As suas marcações entram no artigo de forma agregada, junto com as da outra pessoa, e o que se</w:t>
+      </w:r>
+      <w:r>
+        <w:t xml:space="preserve"> </w:t>
+      </w:r>
+      <w:r>
+        <w:t xml:space="preserve">reporta é o quanto as duas leituras convergem. O guia e as planilhas preenchidas vão para o</w:t>
+      </w:r>
+      <w:r>
+        <w:t xml:space="preserve"> </w:t>
+      </w:r>
+      <w:r>
+        <w:t xml:space="preserve">material aberto do estudo, que fica público.</w:t>
+      </w:r>
+    </w:p>
+    <w:p>
+      <w:pPr>
+        <w:pStyle w:val="BodyText"/>
+      </w:pPr>
+      <w:r>
+        <w:t xml:space="preserve">Seu nome vai nos agradecimentos do artigo, se você quiser. Na descrição do método aparece só o</w:t>
+      </w:r>
+      <w:r>
+        <w:t xml:space="preserve"> </w:t>
+      </w:r>
+      <w:r>
+        <w:t xml:space="preserve">perfil: formação, tempo de sala de aula e etapa em que você atua, sem identificação. Se preferir</w:t>
+      </w:r>
+      <w:r>
+        <w:t xml:space="preserve"> </w:t>
+      </w:r>
+      <w:r>
+        <w:t xml:space="preserve">não ser identificada de nenhuma forma, é só me dizer.</w:t>
+      </w:r>
+    </w:p>
+    <w:p>
+      <w:pPr>
+        <w:pStyle w:val="BodyText"/>
+      </w:pPr>
+      <w:r>
+        <w:t xml:space="preserve">O pagamento combinado não depende do que a sua leitura mostrar. Não existe resultado que me sirva</w:t>
+      </w:r>
+      <w:r>
+        <w:t xml:space="preserve"> </w:t>
+      </w:r>
+      <w:r>
+        <w:t xml:space="preserve">mais do que outro: divergência entre as duas leituras também é resultado, e resultado publicável.</w:t>
+      </w:r>
+    </w:p>
+    <w:bookmarkEnd w:id="18"/>
+    <w:bookmarkStart w:id="19" w:name="quando-terminar"/>
+    <w:p>
+      <w:pPr>
+        <w:pStyle w:val="Heading2"/>
+      </w:pPr>
+      <w:r>
         <w:t xml:space="preserve">Quando terminar</w:t>
       </w:r>
     </w:p>
@@ -1600,8 +1759,8 @@
         <w:t xml:space="preserve">melhor remarcar do que fazer com pressa.</w:t>
       </w:r>
     </w:p>
-    <w:bookmarkEnd w:id="17"/>
-    <w:bookmarkEnd w:id="18"/>
+    <w:bookmarkEnd w:id="19"/>
+    <w:bookmarkEnd w:id="20"/>
     <w:sectPr>
       <w:footnotePr>
         <w:numRestart w:val="eachSect"/>

</xml_diff>